<commit_message>
Supply discovered devices as a list of ConfiguredDevices.
</commit_message>
<xml_diff>
--- a/Requirements.docx
+++ b/Requirements.docx
@@ -81,7 +81,22 @@
         </w:numPr>
       </w:pPr>
       <w:r>
-        <w:t>Aggregate up to 12 Alpaca ObservingConditions devices into a single virtual ObservingConditions device.</w:t>
+        <w:t xml:space="preserve">The virtual </w:t>
+      </w:r>
+      <w:r>
+        <w:t xml:space="preserve">ObservingConditions device </w:t>
+      </w:r>
+      <w:r>
+        <w:t>will a</w:t>
+      </w:r>
+      <w:r>
+        <w:t xml:space="preserve">ggregate up to 12 </w:t>
+      </w:r>
+      <w:r>
+        <w:t xml:space="preserve">real </w:t>
+      </w:r>
+      <w:r>
+        <w:t>Alpaca ObservingConditions devices into a single virtual device.</w:t>
       </w:r>
     </w:p>
     <w:p>
@@ -93,13 +108,7 @@
         </w:numPr>
       </w:pPr>
       <w:r>
-        <w:t xml:space="preserve">Each virtual device property must be </w:t>
-      </w:r>
-      <w:r>
-        <w:t>connected to</w:t>
-      </w:r>
-      <w:r>
-        <w:t>:</w:t>
+        <w:t>Configuration options must be provided to enable the user to:</w:t>
       </w:r>
     </w:p>
     <w:p>
@@ -111,19 +120,55 @@
         </w:numPr>
       </w:pPr>
       <w:r>
-        <w:t xml:space="preserve">a </w:t>
-      </w:r>
-      <w:r>
-        <w:t xml:space="preserve">real device </w:t>
-      </w:r>
-      <w:r>
-        <w:t xml:space="preserve">selected from a list of </w:t>
-      </w:r>
-      <w:r>
-        <w:t>discovered devices</w:t>
-      </w:r>
-      <w:r>
-        <w:t>.</w:t>
+        <w:t>Create a list of available real ObservingConditions devices comprising:</w:t>
+      </w:r>
+    </w:p>
+    <w:p>
+      <w:pPr>
+        <w:pStyle w:val="ListParagraph"/>
+        <w:numPr>
+          <w:ilvl w:val="2"/>
+          <w:numId w:val="1"/>
+        </w:numPr>
+      </w:pPr>
+      <w:r>
+        <w:t>device</w:t>
+      </w:r>
+      <w:r>
+        <w:t>s</w:t>
+      </w:r>
+      <w:r>
+        <w:t xml:space="preserve"> selected from a list of discovered Alpaca devices</w:t>
+      </w:r>
+    </w:p>
+    <w:p>
+      <w:pPr>
+        <w:pStyle w:val="ListParagraph"/>
+        <w:numPr>
+          <w:ilvl w:val="2"/>
+          <w:numId w:val="1"/>
+        </w:numPr>
+      </w:pPr>
+      <w:r>
+        <w:t>m</w:t>
+      </w:r>
+      <w:r>
+        <w:t>anually configur</w:t>
+      </w:r>
+      <w:r>
+        <w:t>ed</w:t>
+      </w:r>
+      <w:r>
+        <w:t xml:space="preserve"> </w:t>
+      </w:r>
+      <w:r>
+        <w:t xml:space="preserve">IP addresses of </w:t>
+      </w:r>
+      <w:r>
+        <w:t>Alpaca devic</w:t>
+      </w:r>
+      <w:r>
+        <w:t>es</w:t>
       </w:r>
     </w:p>
     <w:p>
@@ -135,19 +180,13 @@
         </w:numPr>
       </w:pPr>
       <w:r>
-        <w:t xml:space="preserve">a </w:t>
-      </w:r>
-      <w:r>
-        <w:t>manual</w:t>
-      </w:r>
-      <w:r>
-        <w:t xml:space="preserve">ly configurable </w:t>
-      </w:r>
-      <w:r>
-        <w:t>IP address</w:t>
-      </w:r>
-      <w:r>
-        <w:t>.</w:t>
+        <w:t>Associate e</w:t>
+      </w:r>
+      <w:r>
+        <w:t xml:space="preserve">ach virtual device property </w:t>
+      </w:r>
+      <w:r>
+        <w:t>with a real device property associated with one of the available real ObservingConditions devices.</w:t>
       </w:r>
     </w:p>
     <w:p>
@@ -215,15 +254,7 @@
         </w:numPr>
       </w:pPr>
       <w:r>
-        <w:t xml:space="preserve">The virtual </w:t>
-      </w:r>
-      <w:proofErr w:type="spellStart"/>
-      <w:r>
-        <w:t>IsSafe</w:t>
-      </w:r>
-      <w:proofErr w:type="spellEnd"/>
-      <w:r>
-        <w:t xml:space="preserve"> value must be determined as an OR of all enabled and connected safety monitor devices</w:t>
+        <w:t>The virtual IsSafe value must be determined as an OR of all enabled and connected safety monitor devices</w:t>
       </w:r>
     </w:p>
     <w:p>
@@ -235,26 +266,271 @@
         </w:numPr>
       </w:pPr>
       <w:r>
-        <w:t xml:space="preserve">When </w:t>
-      </w:r>
-      <w:proofErr w:type="spellStart"/>
-      <w:r>
-        <w:t>IsSafe</w:t>
-      </w:r>
-      <w:proofErr w:type="spellEnd"/>
-      <w:r>
-        <w:t xml:space="preserve"> is true a rationale must be exposed through the Action/SupportedActions mechanic.</w:t>
-      </w:r>
-    </w:p>
-    <w:p>
-      <w:pPr>
-        <w:pStyle w:val="Heading1"/>
-      </w:pPr>
-      <w:r>
-        <w:t>SafetyMonitor Rationale Action</w:t>
-      </w:r>
-    </w:p>
-    <w:p/>
+        <w:t>When IsSafe is true a rationale must be exposed through the Action/SupportedActions mechanic</w:t>
+      </w:r>
+      <w:r>
+        <w:t xml:space="preserve"> using the agreed JSON form</w:t>
+      </w:r>
+      <w:r>
+        <w:t>.</w:t>
+      </w:r>
+    </w:p>
+    <w:p>
+      <w:pPr>
+        <w:pStyle w:val="ListParagraph"/>
+        <w:numPr>
+          <w:ilvl w:val="0"/>
+          <w:numId w:val="1"/>
+        </w:numPr>
+      </w:pPr>
+      <w:r>
+        <w:t xml:space="preserve">The conditions under which the safety monitor will return IsSafe = False </w:t>
+      </w:r>
+      <w:r>
+        <w:t>must be d</w:t>
+      </w:r>
+      <w:r>
+        <w:t>etermined by a set of user configurable rules</w:t>
+      </w:r>
+    </w:p>
+    <w:p>
+      <w:pPr>
+        <w:pStyle w:val="Heading2"/>
+      </w:pPr>
+      <w:r>
+        <w:t>Virtual SafetyMonitor Rules</w:t>
+      </w:r>
+    </w:p>
+    <w:p>
+      <w:r>
+        <w:t xml:space="preserve">Each real SafetyMonitor device will have </w:t>
+      </w:r>
+      <w:r>
+        <w:t xml:space="preserve">these rules </w:t>
+      </w:r>
+      <w:r>
+        <w:t>associated with it:</w:t>
+      </w:r>
+    </w:p>
+    <w:p>
+      <w:pPr>
+        <w:pStyle w:val="ListParagraph"/>
+        <w:numPr>
+          <w:ilvl w:val="0"/>
+          <w:numId w:val="7"/>
+        </w:numPr>
+      </w:pPr>
+      <w:r>
+        <w:t>A rule that includes or excludes the state of the sensor from consideration</w:t>
+      </w:r>
+    </w:p>
+    <w:p>
+      <w:pPr>
+        <w:pStyle w:val="ListParagraph"/>
+        <w:numPr>
+          <w:ilvl w:val="0"/>
+          <w:numId w:val="7"/>
+        </w:numPr>
+      </w:pPr>
+      <w:r>
+        <w:t xml:space="preserve">A rule that </w:t>
+      </w:r>
+      <w:r>
+        <w:t xml:space="preserve">forces a given True / False state to be returned </w:t>
+      </w:r>
+      <w:r>
+        <w:t>when the device is in an error state</w:t>
+      </w:r>
+    </w:p>
+    <w:p>
+      <w:r>
+        <w:t>The virtual device</w:t>
+      </w:r>
+      <w:r>
+        <w:t>’</w:t>
+      </w:r>
+      <w:r>
+        <w:t>s</w:t>
+      </w:r>
+      <w:r>
+        <w:t xml:space="preserve"> Is</w:t>
+      </w:r>
+      <w:r>
+        <w:t>Safe property will return False when any real device’s IsSafe property is False, after it’s configured rules have been applied.</w:t>
+      </w:r>
+    </w:p>
+    <w:p>
+      <w:pPr>
+        <w:pStyle w:val="Heading2"/>
+      </w:pPr>
+      <w:r>
+        <w:t>ObservingConditions Rules</w:t>
+      </w:r>
+    </w:p>
+    <w:p>
+      <w:r>
+        <w:t xml:space="preserve">Each property in the virtual observing conditions device </w:t>
+      </w:r>
+      <w:r>
+        <w:t xml:space="preserve">will </w:t>
+      </w:r>
+      <w:r>
+        <w:t>have one or more rules associated with it</w:t>
+      </w:r>
+      <w:r>
+        <w:t xml:space="preserve">. </w:t>
+      </w:r>
+      <w:r>
+        <w:t>When the rule evaluates to True the virtual safety monitor IsSafe property will return False</w:t>
+      </w:r>
+      <w:r>
+        <w:t xml:space="preserve"> and w</w:t>
+      </w:r>
+      <w:r>
+        <w:t xml:space="preserve">hen </w:t>
+      </w:r>
+      <w:r>
+        <w:t xml:space="preserve">it </w:t>
+      </w:r>
+      <w:r>
+        <w:t>evaluates to False the virtual safety monitor IsSafe property will return True.</w:t>
+      </w:r>
+    </w:p>
+    <w:p>
+      <w:r>
+        <w:t>The following rules will be associated with each virtual ObservingConditions device property:</w:t>
+      </w:r>
+    </w:p>
+    <w:p>
+      <w:pPr>
+        <w:pStyle w:val="ListParagraph"/>
+        <w:numPr>
+          <w:ilvl w:val="0"/>
+          <w:numId w:val="5"/>
+        </w:numPr>
+      </w:pPr>
+      <w:r>
+        <w:lastRenderedPageBreak/>
+        <w:t>A rule that includes or excludes the state of the sensor from consideration</w:t>
+      </w:r>
+    </w:p>
+    <w:p>
+      <w:pPr>
+        <w:pStyle w:val="ListParagraph"/>
+        <w:numPr>
+          <w:ilvl w:val="0"/>
+          <w:numId w:val="5"/>
+        </w:numPr>
+      </w:pPr>
+      <w:r>
+        <w:t xml:space="preserve">A rule that returns </w:t>
+      </w:r>
+      <w:r>
+        <w:t xml:space="preserve">IsSafe </w:t>
+      </w:r>
+      <w:r>
+        <w:t>= F</w:t>
+      </w:r>
+      <w:r>
+        <w:t>alse</w:t>
+      </w:r>
+      <w:r>
+        <w:t xml:space="preserve"> when</w:t>
+      </w:r>
+      <w:r>
+        <w:t>:</w:t>
+      </w:r>
+    </w:p>
+    <w:p>
+      <w:pPr>
+        <w:pStyle w:val="ListParagraph"/>
+        <w:numPr>
+          <w:ilvl w:val="1"/>
+          <w:numId w:val="5"/>
+        </w:numPr>
+      </w:pPr>
+      <w:r>
+        <w:t>The o</w:t>
+      </w:r>
+      <w:r>
+        <w:t>bserved value exceeds a given threshold</w:t>
+      </w:r>
+    </w:p>
+    <w:p>
+      <w:pPr>
+        <w:pStyle w:val="ListParagraph"/>
+        <w:numPr>
+          <w:ilvl w:val="1"/>
+          <w:numId w:val="5"/>
+        </w:numPr>
+      </w:pPr>
+      <w:r>
+        <w:t>The o</w:t>
+      </w:r>
+      <w:r>
+        <w:t>bserved value is below a given threshold</w:t>
+      </w:r>
+    </w:p>
+    <w:p>
+      <w:pPr>
+        <w:pStyle w:val="ListParagraph"/>
+        <w:numPr>
+          <w:ilvl w:val="1"/>
+          <w:numId w:val="5"/>
+        </w:numPr>
+      </w:pPr>
+      <w:r>
+        <w:t>The o</w:t>
+      </w:r>
+      <w:r>
+        <w:t>bserved value equals a specified value</w:t>
+      </w:r>
+    </w:p>
+    <w:p>
+      <w:pPr>
+        <w:pStyle w:val="ListParagraph"/>
+        <w:numPr>
+          <w:ilvl w:val="1"/>
+          <w:numId w:val="5"/>
+        </w:numPr>
+      </w:pPr>
+      <w:r>
+        <w:t>T</w:t>
+      </w:r>
+      <w:r>
+        <w:t xml:space="preserve">he device </w:t>
+      </w:r>
+      <w:r>
+        <w:t xml:space="preserve">is in </w:t>
+      </w:r>
+      <w:r>
+        <w:t>an error</w:t>
+      </w:r>
+      <w:r>
+        <w:t xml:space="preserve"> state</w:t>
+      </w:r>
+    </w:p>
+    <w:p>
+      <w:pPr>
+        <w:pStyle w:val="ListParagraph"/>
+        <w:numPr>
+          <w:ilvl w:val="0"/>
+          <w:numId w:val="5"/>
+        </w:numPr>
+      </w:pPr>
+      <w:r>
+        <w:t>A rule that forces a given True / False state to be returned when the device is in an error state</w:t>
+      </w:r>
+    </w:p>
+    <w:p>
+      <w:pPr>
+        <w:pStyle w:val="ListParagraph"/>
+        <w:numPr>
+          <w:ilvl w:val="0"/>
+          <w:numId w:val="5"/>
+        </w:numPr>
+      </w:pPr>
+    </w:p>
     <w:sectPr>
       <w:pgSz w:w="11906" w:h="16838"/>
       <w:pgMar w:top="1134" w:right="1134" w:bottom="1134" w:left="1134" w:header="709" w:footer="709" w:gutter="0"/>
@@ -268,6 +544,318 @@
 <file path=word/numbering.xml><?xml version="1.0" encoding="utf-8"?>
 <w:numbering xmlns:wpc="http://schemas.microsoft.com/office/word/2010/wordprocessingCanvas" xmlns:cx="http://schemas.microsoft.com/office/drawing/2014/chartex" xmlns:cx1="http://schemas.microsoft.com/office/drawing/2015/9/8/chartex" xmlns:cx2="http://schemas.microsoft.com/office/drawing/2015/10/21/chartex" xmlns:cx3="http://schemas.microsoft.com/office/drawing/2016/5/9/chartex" xmlns:cx4="http://schemas.microsoft.com/office/drawing/2016/5/10/chartex" xmlns:cx5="http://schemas.microsoft.com/office/drawing/2016/5/11/chartex" xmlns:cx6="http://schemas.microsoft.com/office/drawing/2016/5/12/chartex" xmlns:cx7="http://schemas.microsoft.com/office/drawing/2016/5/13/chartex" xmlns:cx8="http://schemas.microsoft.com/office/drawing/2016/5/14/chartex" xmlns:mc="http://schemas.openxmlformats.org/markup-compatibility/2006" xmlns:aink="http://schemas.microsoft.com/office/drawing/2016/ink" xmlns:am3d="http://schemas.microsoft.com/office/drawing/2017/model3d" xmlns:o="urn:schemas-microsoft-com:office:office" xmlns:oel="http://schemas.microsoft.com/office/2019/extlst" xmlns:r="http://schemas.openxmlformats.org/officeDocument/2006/relationships" xmlns:m="http://schemas.openxmlformats.org/officeDocument/2006/math" xmlns:v="urn:schemas-microsoft-com:vml" xmlns:wp14="http://schemas.microsoft.com/office/word/2010/wordprocessingDrawing" xmlns:wp="http://schemas.openxmlformats.org/drawingml/2006/wordprocessingDrawing" xmlns:w10="urn:schemas-microsoft-com:office:word" xmlns:w="http://schemas.openxmlformats.org/wordprocessingml/2006/main" xmlns:w14="http://schemas.microsoft.com/office/word/2010/wordml" xmlns:w15="http://schemas.microsoft.com/office/word/2012/wordml" xmlns:w16cex="http://schemas.microsoft.com/office/word/2018/wordml/cex" xmlns:w16cid="http://schemas.microsoft.com/office/word/2016/wordml/cid" xmlns:w16="http://schemas.microsoft.com/office/word/2018/wordml" xmlns:w16du="http://schemas.microsoft.com/office/word/2023/wordml/word16du" xmlns:w16sdtdh="http://schemas.microsoft.com/office/word/2020/wordml/sdtdatahash" xmlns:w16sdtfl="http://schemas.microsoft.com/office/word/2024/wordml/sdtformatlock" xmlns:w16se="http://schemas.microsoft.com/office/word/2015/wordml/symex" xmlns:wpg="http://schemas.microsoft.com/office/word/2010/wordprocessingGroup" xmlns:wpi="http://schemas.microsoft.com/office/word/2010/wordprocessingInk" xmlns:wne="http://schemas.microsoft.com/office/word/2006/wordml" xmlns:wps="http://schemas.microsoft.com/office/word/2010/wordprocessingShape" mc:Ignorable="w14 w15 w16se w16cid w16 w16cex w16sdtdh w16sdtfl w16du wp14">
   <w:abstractNum w:abstractNumId="0" w15:restartNumberingAfterBreak="0">
+    <w:nsid w:val="04F0168B"/>
+    <w:multiLevelType w:val="hybridMultilevel"/>
+    <w:tmpl w:val="0C72D37C"/>
+    <w:lvl w:ilvl="0" w:tplc="0809000F">
+      <w:start w:val="1"/>
+      <w:numFmt w:val="decimal"/>
+      <w:lvlText w:val="%1."/>
+      <w:lvlJc w:val="left"/>
+      <w:pPr>
+        <w:ind w:left="720" w:hanging="360"/>
+      </w:pPr>
+    </w:lvl>
+    <w:lvl w:ilvl="1" w:tplc="08090019" w:tentative="1">
+      <w:start w:val="1"/>
+      <w:numFmt w:val="lowerLetter"/>
+      <w:lvlText w:val="%2."/>
+      <w:lvlJc w:val="left"/>
+      <w:pPr>
+        <w:ind w:left="1440" w:hanging="360"/>
+      </w:pPr>
+    </w:lvl>
+    <w:lvl w:ilvl="2" w:tplc="0809001B" w:tentative="1">
+      <w:start w:val="1"/>
+      <w:numFmt w:val="lowerRoman"/>
+      <w:lvlText w:val="%3."/>
+      <w:lvlJc w:val="right"/>
+      <w:pPr>
+        <w:ind w:left="2160" w:hanging="180"/>
+      </w:pPr>
+    </w:lvl>
+    <w:lvl w:ilvl="3" w:tplc="0809000F" w:tentative="1">
+      <w:start w:val="1"/>
+      <w:numFmt w:val="decimal"/>
+      <w:lvlText w:val="%4."/>
+      <w:lvlJc w:val="left"/>
+      <w:pPr>
+        <w:ind w:left="2880" w:hanging="360"/>
+      </w:pPr>
+    </w:lvl>
+    <w:lvl w:ilvl="4" w:tplc="08090019" w:tentative="1">
+      <w:start w:val="1"/>
+      <w:numFmt w:val="lowerLetter"/>
+      <w:lvlText w:val="%5."/>
+      <w:lvlJc w:val="left"/>
+      <w:pPr>
+        <w:ind w:left="3600" w:hanging="360"/>
+      </w:pPr>
+    </w:lvl>
+    <w:lvl w:ilvl="5" w:tplc="0809001B" w:tentative="1">
+      <w:start w:val="1"/>
+      <w:numFmt w:val="lowerRoman"/>
+      <w:lvlText w:val="%6."/>
+      <w:lvlJc w:val="right"/>
+      <w:pPr>
+        <w:ind w:left="4320" w:hanging="180"/>
+      </w:pPr>
+    </w:lvl>
+    <w:lvl w:ilvl="6" w:tplc="0809000F" w:tentative="1">
+      <w:start w:val="1"/>
+      <w:numFmt w:val="decimal"/>
+      <w:lvlText w:val="%7."/>
+      <w:lvlJc w:val="left"/>
+      <w:pPr>
+        <w:ind w:left="5040" w:hanging="360"/>
+      </w:pPr>
+    </w:lvl>
+    <w:lvl w:ilvl="7" w:tplc="08090019" w:tentative="1">
+      <w:start w:val="1"/>
+      <w:numFmt w:val="lowerLetter"/>
+      <w:lvlText w:val="%8."/>
+      <w:lvlJc w:val="left"/>
+      <w:pPr>
+        <w:ind w:left="5760" w:hanging="360"/>
+      </w:pPr>
+    </w:lvl>
+    <w:lvl w:ilvl="8" w:tplc="0809001B" w:tentative="1">
+      <w:start w:val="1"/>
+      <w:numFmt w:val="lowerRoman"/>
+      <w:lvlText w:val="%9."/>
+      <w:lvlJc w:val="right"/>
+      <w:pPr>
+        <w:ind w:left="6480" w:hanging="180"/>
+      </w:pPr>
+    </w:lvl>
+  </w:abstractNum>
+  <w:abstractNum w:abstractNumId="1" w15:restartNumberingAfterBreak="0">
+    <w:nsid w:val="06510427"/>
+    <w:multiLevelType w:val="hybridMultilevel"/>
+    <w:tmpl w:val="DB1E8C7E"/>
+    <w:lvl w:ilvl="0" w:tplc="08090001">
+      <w:start w:val="1"/>
+      <w:numFmt w:val="bullet"/>
+      <w:lvlText w:val=""/>
+      <w:lvlJc w:val="left"/>
+      <w:pPr>
+        <w:ind w:left="720" w:hanging="360"/>
+      </w:pPr>
+      <w:rPr>
+        <w:rFonts w:ascii="Symbol" w:hAnsi="Symbol" w:hint="default"/>
+      </w:rPr>
+    </w:lvl>
+    <w:lvl w:ilvl="1" w:tplc="08090003" w:tentative="1">
+      <w:start w:val="1"/>
+      <w:numFmt w:val="bullet"/>
+      <w:lvlText w:val="o"/>
+      <w:lvlJc w:val="left"/>
+      <w:pPr>
+        <w:ind w:left="1440" w:hanging="360"/>
+      </w:pPr>
+      <w:rPr>
+        <w:rFonts w:ascii="Courier New" w:hAnsi="Courier New" w:cs="Courier New" w:hint="default"/>
+      </w:rPr>
+    </w:lvl>
+    <w:lvl w:ilvl="2" w:tplc="08090005" w:tentative="1">
+      <w:start w:val="1"/>
+      <w:numFmt w:val="bullet"/>
+      <w:lvlText w:val=""/>
+      <w:lvlJc w:val="left"/>
+      <w:pPr>
+        <w:ind w:left="2160" w:hanging="360"/>
+      </w:pPr>
+      <w:rPr>
+        <w:rFonts w:ascii="Wingdings" w:hAnsi="Wingdings" w:hint="default"/>
+      </w:rPr>
+    </w:lvl>
+    <w:lvl w:ilvl="3" w:tplc="08090001" w:tentative="1">
+      <w:start w:val="1"/>
+      <w:numFmt w:val="bullet"/>
+      <w:lvlText w:val=""/>
+      <w:lvlJc w:val="left"/>
+      <w:pPr>
+        <w:ind w:left="2880" w:hanging="360"/>
+      </w:pPr>
+      <w:rPr>
+        <w:rFonts w:ascii="Symbol" w:hAnsi="Symbol" w:hint="default"/>
+      </w:rPr>
+    </w:lvl>
+    <w:lvl w:ilvl="4" w:tplc="08090003" w:tentative="1">
+      <w:start w:val="1"/>
+      <w:numFmt w:val="bullet"/>
+      <w:lvlText w:val="o"/>
+      <w:lvlJc w:val="left"/>
+      <w:pPr>
+        <w:ind w:left="3600" w:hanging="360"/>
+      </w:pPr>
+      <w:rPr>
+        <w:rFonts w:ascii="Courier New" w:hAnsi="Courier New" w:cs="Courier New" w:hint="default"/>
+      </w:rPr>
+    </w:lvl>
+    <w:lvl w:ilvl="5" w:tplc="08090005" w:tentative="1">
+      <w:start w:val="1"/>
+      <w:numFmt w:val="bullet"/>
+      <w:lvlText w:val=""/>
+      <w:lvlJc w:val="left"/>
+      <w:pPr>
+        <w:ind w:left="4320" w:hanging="360"/>
+      </w:pPr>
+      <w:rPr>
+        <w:rFonts w:ascii="Wingdings" w:hAnsi="Wingdings" w:hint="default"/>
+      </w:rPr>
+    </w:lvl>
+    <w:lvl w:ilvl="6" w:tplc="08090001" w:tentative="1">
+      <w:start w:val="1"/>
+      <w:numFmt w:val="bullet"/>
+      <w:lvlText w:val=""/>
+      <w:lvlJc w:val="left"/>
+      <w:pPr>
+        <w:ind w:left="5040" w:hanging="360"/>
+      </w:pPr>
+      <w:rPr>
+        <w:rFonts w:ascii="Symbol" w:hAnsi="Symbol" w:hint="default"/>
+      </w:rPr>
+    </w:lvl>
+    <w:lvl w:ilvl="7" w:tplc="08090003" w:tentative="1">
+      <w:start w:val="1"/>
+      <w:numFmt w:val="bullet"/>
+      <w:lvlText w:val="o"/>
+      <w:lvlJc w:val="left"/>
+      <w:pPr>
+        <w:ind w:left="5760" w:hanging="360"/>
+      </w:pPr>
+      <w:rPr>
+        <w:rFonts w:ascii="Courier New" w:hAnsi="Courier New" w:cs="Courier New" w:hint="default"/>
+      </w:rPr>
+    </w:lvl>
+    <w:lvl w:ilvl="8" w:tplc="08090005" w:tentative="1">
+      <w:start w:val="1"/>
+      <w:numFmt w:val="bullet"/>
+      <w:lvlText w:val=""/>
+      <w:lvlJc w:val="left"/>
+      <w:pPr>
+        <w:ind w:left="6480" w:hanging="360"/>
+      </w:pPr>
+      <w:rPr>
+        <w:rFonts w:ascii="Wingdings" w:hAnsi="Wingdings" w:hint="default"/>
+      </w:rPr>
+    </w:lvl>
+  </w:abstractNum>
+  <w:abstractNum w:abstractNumId="2" w15:restartNumberingAfterBreak="0">
+    <w:nsid w:val="1CC55FB3"/>
+    <w:multiLevelType w:val="hybridMultilevel"/>
+    <w:tmpl w:val="31B8A620"/>
+    <w:lvl w:ilvl="0" w:tplc="08090001">
+      <w:start w:val="1"/>
+      <w:numFmt w:val="bullet"/>
+      <w:lvlText w:val=""/>
+      <w:lvlJc w:val="left"/>
+      <w:pPr>
+        <w:ind w:left="720" w:hanging="360"/>
+      </w:pPr>
+      <w:rPr>
+        <w:rFonts w:ascii="Symbol" w:hAnsi="Symbol" w:hint="default"/>
+      </w:rPr>
+    </w:lvl>
+    <w:lvl w:ilvl="1" w:tplc="08090003">
+      <w:start w:val="1"/>
+      <w:numFmt w:val="bullet"/>
+      <w:lvlText w:val="o"/>
+      <w:lvlJc w:val="left"/>
+      <w:pPr>
+        <w:ind w:left="1440" w:hanging="360"/>
+      </w:pPr>
+      <w:rPr>
+        <w:rFonts w:ascii="Courier New" w:hAnsi="Courier New" w:cs="Courier New" w:hint="default"/>
+      </w:rPr>
+    </w:lvl>
+    <w:lvl w:ilvl="2" w:tplc="08090005" w:tentative="1">
+      <w:start w:val="1"/>
+      <w:numFmt w:val="bullet"/>
+      <w:lvlText w:val=""/>
+      <w:lvlJc w:val="left"/>
+      <w:pPr>
+        <w:ind w:left="2160" w:hanging="360"/>
+      </w:pPr>
+      <w:rPr>
+        <w:rFonts w:ascii="Wingdings" w:hAnsi="Wingdings" w:hint="default"/>
+      </w:rPr>
+    </w:lvl>
+    <w:lvl w:ilvl="3" w:tplc="08090001" w:tentative="1">
+      <w:start w:val="1"/>
+      <w:numFmt w:val="bullet"/>
+      <w:lvlText w:val=""/>
+      <w:lvlJc w:val="left"/>
+      <w:pPr>
+        <w:ind w:left="2880" w:hanging="360"/>
+      </w:pPr>
+      <w:rPr>
+        <w:rFonts w:ascii="Symbol" w:hAnsi="Symbol" w:hint="default"/>
+      </w:rPr>
+    </w:lvl>
+    <w:lvl w:ilvl="4" w:tplc="08090003" w:tentative="1">
+      <w:start w:val="1"/>
+      <w:numFmt w:val="bullet"/>
+      <w:lvlText w:val="o"/>
+      <w:lvlJc w:val="left"/>
+      <w:pPr>
+        <w:ind w:left="3600" w:hanging="360"/>
+      </w:pPr>
+      <w:rPr>
+        <w:rFonts w:ascii="Courier New" w:hAnsi="Courier New" w:cs="Courier New" w:hint="default"/>
+      </w:rPr>
+    </w:lvl>
+    <w:lvl w:ilvl="5" w:tplc="08090005" w:tentative="1">
+      <w:start w:val="1"/>
+      <w:numFmt w:val="bullet"/>
+      <w:lvlText w:val=""/>
+      <w:lvlJc w:val="left"/>
+      <w:pPr>
+        <w:ind w:left="4320" w:hanging="360"/>
+      </w:pPr>
+      <w:rPr>
+        <w:rFonts w:ascii="Wingdings" w:hAnsi="Wingdings" w:hint="default"/>
+      </w:rPr>
+    </w:lvl>
+    <w:lvl w:ilvl="6" w:tplc="08090001" w:tentative="1">
+      <w:start w:val="1"/>
+      <w:numFmt w:val="bullet"/>
+      <w:lvlText w:val=""/>
+      <w:lvlJc w:val="left"/>
+      <w:pPr>
+        <w:ind w:left="5040" w:hanging="360"/>
+      </w:pPr>
+      <w:rPr>
+        <w:rFonts w:ascii="Symbol" w:hAnsi="Symbol" w:hint="default"/>
+      </w:rPr>
+    </w:lvl>
+    <w:lvl w:ilvl="7" w:tplc="08090003" w:tentative="1">
+      <w:start w:val="1"/>
+      <w:numFmt w:val="bullet"/>
+      <w:lvlText w:val="o"/>
+      <w:lvlJc w:val="left"/>
+      <w:pPr>
+        <w:ind w:left="5760" w:hanging="360"/>
+      </w:pPr>
+      <w:rPr>
+        <w:rFonts w:ascii="Courier New" w:hAnsi="Courier New" w:cs="Courier New" w:hint="default"/>
+      </w:rPr>
+    </w:lvl>
+    <w:lvl w:ilvl="8" w:tplc="08090005" w:tentative="1">
+      <w:start w:val="1"/>
+      <w:numFmt w:val="bullet"/>
+      <w:lvlText w:val=""/>
+      <w:lvlJc w:val="left"/>
+      <w:pPr>
+        <w:ind w:left="6480" w:hanging="360"/>
+      </w:pPr>
+      <w:rPr>
+        <w:rFonts w:ascii="Wingdings" w:hAnsi="Wingdings" w:hint="default"/>
+      </w:rPr>
+    </w:lvl>
+  </w:abstractNum>
+  <w:abstractNum w:abstractNumId="3" w15:restartNumberingAfterBreak="0">
     <w:nsid w:val="3AA330DB"/>
     <w:multiLevelType w:val="hybridMultilevel"/>
     <w:tmpl w:val="EB048996"/>
@@ -295,6 +883,119 @@
         <w:rFonts w:ascii="Courier New" w:hAnsi="Courier New" w:cs="Courier New" w:hint="default"/>
       </w:rPr>
     </w:lvl>
+    <w:lvl w:ilvl="2" w:tplc="08090005">
+      <w:start w:val="1"/>
+      <w:numFmt w:val="bullet"/>
+      <w:lvlText w:val=""/>
+      <w:lvlJc w:val="left"/>
+      <w:pPr>
+        <w:ind w:left="2160" w:hanging="360"/>
+      </w:pPr>
+      <w:rPr>
+        <w:rFonts w:ascii="Wingdings" w:hAnsi="Wingdings" w:hint="default"/>
+      </w:rPr>
+    </w:lvl>
+    <w:lvl w:ilvl="3" w:tplc="08090001" w:tentative="1">
+      <w:start w:val="1"/>
+      <w:numFmt w:val="bullet"/>
+      <w:lvlText w:val=""/>
+      <w:lvlJc w:val="left"/>
+      <w:pPr>
+        <w:ind w:left="2880" w:hanging="360"/>
+      </w:pPr>
+      <w:rPr>
+        <w:rFonts w:ascii="Symbol" w:hAnsi="Symbol" w:hint="default"/>
+      </w:rPr>
+    </w:lvl>
+    <w:lvl w:ilvl="4" w:tplc="08090003" w:tentative="1">
+      <w:start w:val="1"/>
+      <w:numFmt w:val="bullet"/>
+      <w:lvlText w:val="o"/>
+      <w:lvlJc w:val="left"/>
+      <w:pPr>
+        <w:ind w:left="3600" w:hanging="360"/>
+      </w:pPr>
+      <w:rPr>
+        <w:rFonts w:ascii="Courier New" w:hAnsi="Courier New" w:cs="Courier New" w:hint="default"/>
+      </w:rPr>
+    </w:lvl>
+    <w:lvl w:ilvl="5" w:tplc="08090005" w:tentative="1">
+      <w:start w:val="1"/>
+      <w:numFmt w:val="bullet"/>
+      <w:lvlText w:val=""/>
+      <w:lvlJc w:val="left"/>
+      <w:pPr>
+        <w:ind w:left="4320" w:hanging="360"/>
+      </w:pPr>
+      <w:rPr>
+        <w:rFonts w:ascii="Wingdings" w:hAnsi="Wingdings" w:hint="default"/>
+      </w:rPr>
+    </w:lvl>
+    <w:lvl w:ilvl="6" w:tplc="08090001" w:tentative="1">
+      <w:start w:val="1"/>
+      <w:numFmt w:val="bullet"/>
+      <w:lvlText w:val=""/>
+      <w:lvlJc w:val="left"/>
+      <w:pPr>
+        <w:ind w:left="5040" w:hanging="360"/>
+      </w:pPr>
+      <w:rPr>
+        <w:rFonts w:ascii="Symbol" w:hAnsi="Symbol" w:hint="default"/>
+      </w:rPr>
+    </w:lvl>
+    <w:lvl w:ilvl="7" w:tplc="08090003" w:tentative="1">
+      <w:start w:val="1"/>
+      <w:numFmt w:val="bullet"/>
+      <w:lvlText w:val="o"/>
+      <w:lvlJc w:val="left"/>
+      <w:pPr>
+        <w:ind w:left="5760" w:hanging="360"/>
+      </w:pPr>
+      <w:rPr>
+        <w:rFonts w:ascii="Courier New" w:hAnsi="Courier New" w:cs="Courier New" w:hint="default"/>
+      </w:rPr>
+    </w:lvl>
+    <w:lvl w:ilvl="8" w:tplc="08090005" w:tentative="1">
+      <w:start w:val="1"/>
+      <w:numFmt w:val="bullet"/>
+      <w:lvlText w:val=""/>
+      <w:lvlJc w:val="left"/>
+      <w:pPr>
+        <w:ind w:left="6480" w:hanging="360"/>
+      </w:pPr>
+      <w:rPr>
+        <w:rFonts w:ascii="Wingdings" w:hAnsi="Wingdings" w:hint="default"/>
+      </w:rPr>
+    </w:lvl>
+  </w:abstractNum>
+  <w:abstractNum w:abstractNumId="4" w15:restartNumberingAfterBreak="0">
+    <w:nsid w:val="4EF714DF"/>
+    <w:multiLevelType w:val="hybridMultilevel"/>
+    <w:tmpl w:val="BD1EBEFA"/>
+    <w:lvl w:ilvl="0" w:tplc="08090001">
+      <w:start w:val="1"/>
+      <w:numFmt w:val="bullet"/>
+      <w:lvlText w:val=""/>
+      <w:lvlJc w:val="left"/>
+      <w:pPr>
+        <w:ind w:left="720" w:hanging="360"/>
+      </w:pPr>
+      <w:rPr>
+        <w:rFonts w:ascii="Symbol" w:hAnsi="Symbol" w:hint="default"/>
+      </w:rPr>
+    </w:lvl>
+    <w:lvl w:ilvl="1" w:tplc="08090003" w:tentative="1">
+      <w:start w:val="1"/>
+      <w:numFmt w:val="bullet"/>
+      <w:lvlText w:val="o"/>
+      <w:lvlJc w:val="left"/>
+      <w:pPr>
+        <w:ind w:left="1440" w:hanging="360"/>
+      </w:pPr>
+      <w:rPr>
+        <w:rFonts w:ascii="Courier New" w:hAnsi="Courier New" w:cs="Courier New" w:hint="default"/>
+      </w:rPr>
+    </w:lvl>
     <w:lvl w:ilvl="2" w:tplc="08090005" w:tentative="1">
       <w:start w:val="1"/>
       <w:numFmt w:val="bullet"/>
@@ -380,7 +1081,93 @@
       </w:rPr>
     </w:lvl>
   </w:abstractNum>
-  <w:abstractNum w:abstractNumId="1" w15:restartNumberingAfterBreak="0">
+  <w:abstractNum w:abstractNumId="5" w15:restartNumberingAfterBreak="0">
+    <w:nsid w:val="64B66A26"/>
+    <w:multiLevelType w:val="hybridMultilevel"/>
+    <w:tmpl w:val="02B8C938"/>
+    <w:lvl w:ilvl="0" w:tplc="0809000F">
+      <w:start w:val="1"/>
+      <w:numFmt w:val="decimal"/>
+      <w:lvlText w:val="%1."/>
+      <w:lvlJc w:val="left"/>
+      <w:pPr>
+        <w:ind w:left="720" w:hanging="360"/>
+      </w:pPr>
+    </w:lvl>
+    <w:lvl w:ilvl="1" w:tplc="08090019" w:tentative="1">
+      <w:start w:val="1"/>
+      <w:numFmt w:val="lowerLetter"/>
+      <w:lvlText w:val="%2."/>
+      <w:lvlJc w:val="left"/>
+      <w:pPr>
+        <w:ind w:left="1440" w:hanging="360"/>
+      </w:pPr>
+    </w:lvl>
+    <w:lvl w:ilvl="2" w:tplc="0809001B" w:tentative="1">
+      <w:start w:val="1"/>
+      <w:numFmt w:val="lowerRoman"/>
+      <w:lvlText w:val="%3."/>
+      <w:lvlJc w:val="right"/>
+      <w:pPr>
+        <w:ind w:left="2160" w:hanging="180"/>
+      </w:pPr>
+    </w:lvl>
+    <w:lvl w:ilvl="3" w:tplc="0809000F" w:tentative="1">
+      <w:start w:val="1"/>
+      <w:numFmt w:val="decimal"/>
+      <w:lvlText w:val="%4."/>
+      <w:lvlJc w:val="left"/>
+      <w:pPr>
+        <w:ind w:left="2880" w:hanging="360"/>
+      </w:pPr>
+    </w:lvl>
+    <w:lvl w:ilvl="4" w:tplc="08090019" w:tentative="1">
+      <w:start w:val="1"/>
+      <w:numFmt w:val="lowerLetter"/>
+      <w:lvlText w:val="%5."/>
+      <w:lvlJc w:val="left"/>
+      <w:pPr>
+        <w:ind w:left="3600" w:hanging="360"/>
+      </w:pPr>
+    </w:lvl>
+    <w:lvl w:ilvl="5" w:tplc="0809001B" w:tentative="1">
+      <w:start w:val="1"/>
+      <w:numFmt w:val="lowerRoman"/>
+      <w:lvlText w:val="%6."/>
+      <w:lvlJc w:val="right"/>
+      <w:pPr>
+        <w:ind w:left="4320" w:hanging="180"/>
+      </w:pPr>
+    </w:lvl>
+    <w:lvl w:ilvl="6" w:tplc="0809000F" w:tentative="1">
+      <w:start w:val="1"/>
+      <w:numFmt w:val="decimal"/>
+      <w:lvlText w:val="%7."/>
+      <w:lvlJc w:val="left"/>
+      <w:pPr>
+        <w:ind w:left="5040" w:hanging="360"/>
+      </w:pPr>
+    </w:lvl>
+    <w:lvl w:ilvl="7" w:tplc="08090019" w:tentative="1">
+      <w:start w:val="1"/>
+      <w:numFmt w:val="lowerLetter"/>
+      <w:lvlText w:val="%8."/>
+      <w:lvlJc w:val="left"/>
+      <w:pPr>
+        <w:ind w:left="5760" w:hanging="360"/>
+      </w:pPr>
+    </w:lvl>
+    <w:lvl w:ilvl="8" w:tplc="0809001B" w:tentative="1">
+      <w:start w:val="1"/>
+      <w:numFmt w:val="lowerRoman"/>
+      <w:lvlText w:val="%9."/>
+      <w:lvlJc w:val="right"/>
+      <w:pPr>
+        <w:ind w:left="6480" w:hanging="180"/>
+      </w:pPr>
+    </w:lvl>
+  </w:abstractNum>
+  <w:abstractNum w:abstractNumId="6" w15:restartNumberingAfterBreak="0">
     <w:nsid w:val="6B666A28"/>
     <w:multiLevelType w:val="hybridMultilevel"/>
     <w:tmpl w:val="A2CAC22C"/>
@@ -494,10 +1281,25 @@
     </w:lvl>
   </w:abstractNum>
   <w:num w:numId="1" w16cid:durableId="350834854">
+    <w:abstractNumId w:val="3"/>
+  </w:num>
+  <w:num w:numId="2" w16cid:durableId="1875344571">
+    <w:abstractNumId w:val="6"/>
+  </w:num>
+  <w:num w:numId="3" w16cid:durableId="1087456774">
+    <w:abstractNumId w:val="1"/>
+  </w:num>
+  <w:num w:numId="4" w16cid:durableId="1080562060">
+    <w:abstractNumId w:val="5"/>
+  </w:num>
+  <w:num w:numId="5" w16cid:durableId="1696420943">
+    <w:abstractNumId w:val="2"/>
+  </w:num>
+  <w:num w:numId="6" w16cid:durableId="1149709684">
     <w:abstractNumId w:val="0"/>
   </w:num>
-  <w:num w:numId="2" w16cid:durableId="1875344571">
-    <w:abstractNumId w:val="1"/>
+  <w:num w:numId="7" w16cid:durableId="946810394">
+    <w:abstractNumId w:val="4"/>
   </w:num>
 </w:numbering>
 </file>
@@ -900,6 +1702,7 @@
   <w:style w:type="paragraph" w:default="1" w:styleId="Normal">
     <w:name w:val="Normal"/>
     <w:qFormat/>
+    <w:rsid w:val="00E5629D"/>
   </w:style>
   <w:style w:type="paragraph" w:styleId="Heading1">
     <w:name w:val="heading 1"/>
@@ -928,7 +1731,6 @@
     <w:next w:val="Normal"/>
     <w:link w:val="Heading2Char"/>
     <w:uiPriority w:val="9"/>
-    <w:semiHidden/>
     <w:unhideWhenUsed/>
     <w:qFormat/>
     <w:rsid w:val="0011559F"/>
@@ -1145,7 +1947,6 @@
     <w:basedOn w:val="DefaultParagraphFont"/>
     <w:link w:val="Heading2"/>
     <w:uiPriority w:val="9"/>
-    <w:semiHidden/>
     <w:rsid w:val="0011559F"/>
     <w:rPr>
       <w:rFonts w:asciiTheme="majorHAnsi" w:eastAsiaTheme="majorEastAsia" w:hAnsiTheme="majorHAnsi" w:cstheme="majorBidi"/>

</xml_diff>